<commit_message>
feat: fix error in document extraction and remove docx data
</commit_message>
<xml_diff>
--- a/triplet_extraction/data/luat_dat_dai/files/58.2024.QH15(W).docx
+++ b/triplet_extraction/data/luat_dat_dai/files/58.2024.QH15(W).docx
@@ -1,6 +1,6 @@
 
 <file path=word/document.xml><?xml version="1.0" encoding="utf-8"?>
-<w:document xmlns:wpc="http://schemas.microsoft.com/office/word/2010/wordprocessingCanvas" xmlns:cx="http://schemas.microsoft.com/office/drawing/2014/chartex" xmlns:mc="http://schemas.openxmlformats.org/markup-compatibility/2006" xmlns:o="urn:schemas-microsoft-com:office:office" xmlns:r="http://schemas.openxmlformats.org/officeDocument/2006/relationships" xmlns:m="http://schemas.openxmlformats.org/officeDocument/2006/math" xmlns:v="urn:schemas-microsoft-com:vml" xmlns:wp14="http://schemas.microsoft.com/office/word/2010/wordprocessingDrawing" xmlns:wp="http://schemas.openxmlformats.org/drawingml/2006/wordprocessingDrawing" xmlns:w10="urn:schemas-microsoft-com:office:word" xmlns:w="http://schemas.openxmlformats.org/wordprocessingml/2006/main" xmlns:w14="http://schemas.microsoft.com/office/word/2010/wordml" xmlns:w15="http://schemas.microsoft.com/office/word/2012/wordml" xmlns:w16se="http://schemas.microsoft.com/office/word/2015/wordml/symex" xmlns:wpg="http://schemas.microsoft.com/office/word/2010/wordprocessingGroup" xmlns:wpi="http://schemas.microsoft.com/office/word/2010/wordprocessingInk" xmlns:wne="http://schemas.microsoft.com/office/word/2006/wordml" xmlns:wps="http://schemas.microsoft.com/office/word/2010/wordprocessingShape" mc:Ignorable="w14 w15 w16se wp14">
+<w:document xmlns:wpc="http://schemas.microsoft.com/office/word/2010/wordprocessingCanvas" xmlns:cx="http://schemas.microsoft.com/office/drawing/2014/chartex" xmlns:cx1="http://schemas.microsoft.com/office/drawing/2015/9/8/chartex" xmlns:cx2="http://schemas.microsoft.com/office/drawing/2015/10/21/chartex" xmlns:cx3="http://schemas.microsoft.com/office/drawing/2016/5/9/chartex" xmlns:cx4="http://schemas.microsoft.com/office/drawing/2016/5/10/chartex" xmlns:cx5="http://schemas.microsoft.com/office/drawing/2016/5/11/chartex" xmlns:cx6="http://schemas.microsoft.com/office/drawing/2016/5/12/chartex" xmlns:cx7="http://schemas.microsoft.com/office/drawing/2016/5/13/chartex" xmlns:cx8="http://schemas.microsoft.com/office/drawing/2016/5/14/chartex" xmlns:mc="http://schemas.openxmlformats.org/markup-compatibility/2006" xmlns:aink="http://schemas.microsoft.com/office/drawing/2016/ink" xmlns:am3d="http://schemas.microsoft.com/office/drawing/2017/model3d" xmlns:o="urn:schemas-microsoft-com:office:office" xmlns:oel="http://schemas.microsoft.com/office/2019/extlst" xmlns:r="http://schemas.openxmlformats.org/officeDocument/2006/relationships" xmlns:m="http://schemas.openxmlformats.org/officeDocument/2006/math" xmlns:v="urn:schemas-microsoft-com:vml" xmlns:wp14="http://schemas.microsoft.com/office/word/2010/wordprocessingDrawing" xmlns:wp="http://schemas.openxmlformats.org/drawingml/2006/wordprocessingDrawing" xmlns:w10="urn:schemas-microsoft-com:office:word" xmlns:w="http://schemas.openxmlformats.org/wordprocessingml/2006/main" xmlns:w14="http://schemas.microsoft.com/office/word/2010/wordml" xmlns:w15="http://schemas.microsoft.com/office/word/2012/wordml" xmlns:w16cex="http://schemas.microsoft.com/office/word/2018/wordml/cex" xmlns:w16cid="http://schemas.microsoft.com/office/word/2016/wordml/cid" xmlns:w16="http://schemas.microsoft.com/office/word/2018/wordml" xmlns:w16du="http://schemas.microsoft.com/office/word/2023/wordml/word16du" xmlns:w16sdtdh="http://schemas.microsoft.com/office/word/2020/wordml/sdtdatahash" xmlns:w16sdtfl="http://schemas.microsoft.com/office/word/2024/wordml/sdtformatlock" xmlns:w16se="http://schemas.microsoft.com/office/word/2015/wordml/symex" xmlns:wpg="http://schemas.microsoft.com/office/word/2010/wordprocessingGroup" xmlns:wpi="http://schemas.microsoft.com/office/word/2010/wordprocessingInk" xmlns:wne="http://schemas.microsoft.com/office/word/2006/wordml" xmlns:wps="http://schemas.microsoft.com/office/word/2010/wordprocessingShape" mc:Ignorable="w14 w15 w16se w16cid w16 w16cex w16sdtdh w16sdtfl w16du wp14">
   <w:body>
     <w:tbl>
       <w:tblPr>
@@ -1072,7 +1072,6 @@
           <w:sz w:val="26"/>
           <w:szCs w:val="26"/>
         </w:rPr>
-        <w:lastRenderedPageBreak/>
         <w:t>24. Vốn đầu tư công bao gồm vốn ngân sách nhà nước chi cho đầu tư công; vốn từ nguồn thu hợp pháp của các cơ quan nhà nước, đơn vị sự nghiệp công lập dành để đầu tư theo quy định của pháp luật.</w:t>
       </w:r>
     </w:p>
@@ -1361,17 +1360,7 @@
           <w:szCs w:val="26"/>
         </w:rPr>
         <w:br/>
-        <w:t xml:space="preserve">Hội đồng nhân dân cấp tỉnh quyết định cơ chế, chính sách cụ thể và bố trí vốn ngân sách địa phương để thực hiện chính sách này. Ủy ban nhân dân cấp tỉnh </w:t>
-      </w:r>
-      <w:r>
-        <w:rPr>
-          <w:rFonts w:ascii="Arial" w:eastAsia="Times New Roman" w:hAnsi="Arial" w:cs="Arial"/>
-          <w:color w:val="2E2E2E"/>
-          <w:sz w:val="26"/>
-          <w:szCs w:val="26"/>
-        </w:rPr>
-        <w:lastRenderedPageBreak/>
-        <w:t>thực hiện ủy thác vốn ngân sách địa phương để thực hiện chính sách ưu đãi theo quyết định của Hội đồng nhân dân cấp tỉnh.</w:t>
+        <w:t>Hội đồng nhân dân cấp tỉnh quyết định cơ chế, chính sách cụ thể và bố trí vốn ngân sách địa phương để thực hiện chính sách này. Ủy ban nhân dân cấp tỉnh thực hiện ủy thác vốn ngân sách địa phương để thực hiện chính sách ưu đãi theo quyết định của Hội đồng nhân dân cấp tỉnh.</w:t>
       </w:r>
     </w:p>
     <w:p>
@@ -1975,7 +1964,6 @@
           <w:sz w:val="26"/>
           <w:szCs w:val="26"/>
         </w:rPr>
-        <w:lastRenderedPageBreak/>
         <w:t>b) An ninh và trật tự, an toàn xã hội;</w:t>
       </w:r>
     </w:p>
@@ -2458,7 +2446,6 @@
           <w:sz w:val="26"/>
           <w:szCs w:val="26"/>
         </w:rPr>
-        <w:lastRenderedPageBreak/>
         <w:t>1. Dự án không phân biệt tổng mức đầu tư thuộc một trong các trường hợp sau đây:</w:t>
       </w:r>
     </w:p>
@@ -3019,7 +3006,6 @@
           <w:sz w:val="26"/>
           <w:szCs w:val="26"/>
         </w:rPr>
-        <w:lastRenderedPageBreak/>
         <w:t>b) Nghiên cứu khoa học, môi trường, công nghệ thông tin, phát thanh, truyền hình, tài chính, ngân hàng;</w:t>
       </w:r>
     </w:p>
@@ -3602,17 +3588,7 @@
           <w:sz w:val="26"/>
           <w:szCs w:val="26"/>
         </w:rPr>
-        <w:t xml:space="preserve">3. Việc điều chỉnh tiêu chí phân loại dự án đầu tư công quy định tại khoản 1 và khoản 2 Điều này được thực hiện trong trường hợp chỉ số giá có biến động lớn hoặc có điều chỉnh lớn về phân cấp quản lý đầu tư công liên quan đến tiêu chí </w:t>
-      </w:r>
-      <w:r>
-        <w:rPr>
-          <w:rFonts w:ascii="Arial" w:eastAsia="Times New Roman" w:hAnsi="Arial" w:cs="Arial"/>
-          <w:color w:val="2E2E2E"/>
-          <w:sz w:val="26"/>
-          <w:szCs w:val="26"/>
-        </w:rPr>
-        <w:lastRenderedPageBreak/>
-        <w:t>phân loại dự án đầu tư công hoặc xuất hiện các yếu tố quan trọng khác tác động tới tiêu chí phân loại dự án đầu tư công.</w:t>
+        <w:t>3. Việc điều chỉnh tiêu chí phân loại dự án đầu tư công quy định tại khoản 1 và khoản 2 Điều này được thực hiện trong trường hợp chỉ số giá có biến động lớn hoặc có điều chỉnh lớn về phân cấp quản lý đầu tư công liên quan đến tiêu chí phân loại dự án đầu tư công hoặc xuất hiện các yếu tố quan trọng khác tác động tới tiêu chí phân loại dự án đầu tư công.</w:t>
       </w:r>
     </w:p>
     <w:p>
@@ -4038,7 +4014,6 @@
           <w:sz w:val="26"/>
           <w:szCs w:val="26"/>
         </w:rPr>
-        <w:lastRenderedPageBreak/>
         <w:t>đ) Danh mục dự án trên địa bàn, bao gồm quy mô, tổng mức đầu tư, thời gian, địa điểm; báo cáo đánh giá tác động tổng thể của dự án tới địa bàn đầu tư;</w:t>
       </w:r>
     </w:p>
@@ -4373,7 +4348,6 @@
           <w:sz w:val="26"/>
           <w:szCs w:val="26"/>
         </w:rPr>
-        <w:lastRenderedPageBreak/>
         <w:t>2. Quyết định đầu tư chương trình, dự án khi chưa được cấp có thẩm quyền quyết định chủ trương đầu tư theo quy định; quyết định đầu tư hoặc quyết định điều chỉnh chương trình, dự án không đúng thẩm quyền, không đúng với các nội dung về mục tiêu, địa điểm, vượt mức vốn đầu tư công, vượt mức vốn đầu tư công của ngân sách cấp trên, vượt tổng mức đầu tư trong chủ trương đầu tư đã được cấp có thẩm quyền quyết định. Quyết định điều chỉnh tổng vốn đầu tư của chương trình, tổng mức đầu tư của dự án trái quy định của pháp luật.</w:t>
       </w:r>
     </w:p>
@@ -4696,7 +4670,6 @@
           <w:sz w:val="26"/>
           <w:szCs w:val="26"/>
         </w:rPr>
-        <w:lastRenderedPageBreak/>
         <w:t>a) Chương trình mục tiêu quốc gia;</w:t>
       </w:r>
     </w:p>
@@ -5035,7 +5008,6 @@
           <w:sz w:val="26"/>
           <w:szCs w:val="26"/>
         </w:rPr>
-        <w:lastRenderedPageBreak/>
         <w:t>a) Dự án nhóm B, nhóm C sử dụng vốn ngân sách địa phương, bao gồm cả vốn bổ sung có mục tiêu từ ngân sách cấp trên, nguồn vốn hợp pháp của địa phương thuộc cấp mình quản lý;</w:t>
       </w:r>
     </w:p>
@@ -5297,7 +5269,6 @@
           <w:sz w:val="26"/>
           <w:szCs w:val="26"/>
         </w:rPr>
-        <w:lastRenderedPageBreak/>
         <w:t>2. Không trùng lặp với các chương trình, dự án đã có quyết định chủ trương đầu tư hoặc đã có quyết định đầu tư.</w:t>
       </w:r>
     </w:p>
@@ -5680,7 +5651,6 @@
           <w:sz w:val="26"/>
           <w:szCs w:val="26"/>
         </w:rPr>
-        <w:lastRenderedPageBreak/>
         <w:t>5. Quốc hội xem xét, thông qua nghị quyết về chủ trương đầu tư đối với chương trình mục tiêu quốc gia, dự án quan trọng quốc gia với nội dung chủ yếu sau đây:</w:t>
       </w:r>
     </w:p>
@@ -6045,17 +6015,7 @@
           <w:sz w:val="26"/>
           <w:szCs w:val="26"/>
         </w:rPr>
-        <w:t xml:space="preserve">đ) Những thông số cơ bản của chương trình, dự án, bao gồm mục tiêu, quy mô, hình thức đầu tư, phạm vi, địa điểm, diện tích đất cần sử dụng, thời gian, tiến độ </w:t>
-      </w:r>
-      <w:r>
-        <w:rPr>
-          <w:rFonts w:ascii="Arial" w:eastAsia="Times New Roman" w:hAnsi="Arial" w:cs="Arial"/>
-          <w:color w:val="2E2E2E"/>
-          <w:sz w:val="26"/>
-          <w:szCs w:val="26"/>
-        </w:rPr>
-        <w:lastRenderedPageBreak/>
-        <w:t>thực hiện, phương án lựa chọn công nghệ chính, giải pháp bảo vệ môi trường, nguồn vốn, khả năng thu hồi vốn và trả nợ vốn vay;</w:t>
+        <w:t>đ) Những thông số cơ bản của chương trình, dự án, bao gồm mục tiêu, quy mô, hình thức đầu tư, phạm vi, địa điểm, diện tích đất cần sử dụng, thời gian, tiến độ thực hiện, phương án lựa chọn công nghệ chính, giải pháp bảo vệ môi trường, nguồn vốn, khả năng thu hồi vốn và trả nợ vốn vay;</w:t>
       </w:r>
     </w:p>
     <w:p>
@@ -6389,17 +6349,7 @@
           <w:szCs w:val="26"/>
         </w:rPr>
         <w:br/>
-        <w:t xml:space="preserve">Hội đồng thẩm định liên ngành hoặc cơ quan chủ trì thẩm định được mời tổ chức, cá nhân có chuyên môn, kinh nghiệm tham gia thẩm định báo cáo nghiên </w:t>
-      </w:r>
-      <w:r>
-        <w:rPr>
-          <w:rFonts w:ascii="Arial" w:eastAsia="Times New Roman" w:hAnsi="Arial" w:cs="Arial"/>
-          <w:color w:val="2E2E2E"/>
-          <w:sz w:val="26"/>
-          <w:szCs w:val="26"/>
-        </w:rPr>
-        <w:lastRenderedPageBreak/>
-        <w:t>cứu tiền khả thi hoặc yêu cầu chủ đầu tư lựa chọn tổ chức, cá nhân có chuyên môn, kinh nghiệm tham gia thẩm định báo cáo nghiên cứu tiền khả thi.</w:t>
+        <w:t>Hội đồng thẩm định liên ngành hoặc cơ quan chủ trì thẩm định được mời tổ chức, cá nhân có chuyên môn, kinh nghiệm tham gia thẩm định báo cáo nghiên cứu tiền khả thi hoặc yêu cầu chủ đầu tư lựa chọn tổ chức, cá nhân có chuyên môn, kinh nghiệm tham gia thẩm định báo cáo nghiên cứu tiền khả thi.</w:t>
       </w:r>
     </w:p>
     <w:p>
@@ -6703,7 +6653,6 @@
           <w:sz w:val="26"/>
           <w:szCs w:val="26"/>
         </w:rPr>
-        <w:lastRenderedPageBreak/>
         <w:t>2. Người đứng đầu Bộ, cơ quan trung ương quyết định chủ trương đầu tư, bao gồm mục tiêu, quy mô, tổng mức đầu tư, cơ cấu nguồn vốn, địa điểm, thời gian thực hiện, dự kiến kế hoạch bố trí vốn.</w:t>
       </w:r>
     </w:p>
@@ -7010,7 +6959,6 @@
           <w:sz w:val="26"/>
           <w:szCs w:val="26"/>
         </w:rPr>
-        <w:lastRenderedPageBreak/>
         <w:t>a) Giao đơn vị trực thuộc tổ chức lập báo cáo nghiên cứu tiền khả thi, báo cáo đề xuất chủ trương đầu tư;</w:t>
       </w:r>
     </w:p>
@@ -7291,7 +7239,6 @@
           <w:sz w:val="26"/>
           <w:szCs w:val="26"/>
         </w:rPr>
-        <w:lastRenderedPageBreak/>
         <w:t>2. Trên cơ sở quyết định của Chủ tịch Ủy ban nhân dân cấp tỉnh, Ủy ban nhân dân cấp huyện được giao là cơ quan chủ quản thực hiện dự án có trách nhiệm tổ chức lập, thẩm định, quyết định chủ trương đầu tư dự án theo quy định tại </w:t>
       </w:r>
       <w:r>
@@ -7602,7 +7549,6 @@
           <w:sz w:val="26"/>
           <w:szCs w:val="26"/>
         </w:rPr>
-        <w:lastRenderedPageBreak/>
         <w:t>7. Phân tích, đánh giá sơ bộ những ảnh hưởng, tác động về môi trường, xã hội của chương trình, tính toán hiệu quả đầu tư về mặt kinh tế - xã hội của chương trình;</w:t>
       </w:r>
     </w:p>
@@ -7977,15 +7923,6 @@
           <w:szCs w:val="26"/>
         </w:rPr>
         <w:br/>
-      </w:r>
-      <w:r>
-        <w:rPr>
-          <w:rFonts w:ascii="Arial" w:eastAsia="Times New Roman" w:hAnsi="Arial" w:cs="Arial"/>
-          <w:color w:val="2E2E2E"/>
-          <w:sz w:val="26"/>
-          <w:szCs w:val="26"/>
-        </w:rPr>
-        <w:lastRenderedPageBreak/>
         <w:t>Nội dung chủ yếu của báo cáo đề xuất chủ trương đầu tư dự án nhóm B, nhóm C bao gồm:</w:t>
       </w:r>
     </w:p>
@@ -8346,7 +8283,6 @@
           <w:sz w:val="26"/>
           <w:szCs w:val="26"/>
         </w:rPr>
-        <w:lastRenderedPageBreak/>
         <w:t>4. Chủ tịch Ủy ban nhân dân các cấp giao cơ quan chuyên môn quản lý đầu tư công chủ trì, phối hợp với các cơ quan liên quan thẩm định nguồn vốn và khả năng cân đối vốn đối với chương trình, dự án sử dụng vốn đầu tư công thuộc cấp mình quản lý trong phạm vi tổng số vốn đầu tư công trung hạn được Thủ tướng Chính phủ hoặc cấp có thẩm quyền thông báo cho giai đoạn sau, tổng mức vốn đầu tư công trung hạn hiện hành được Quốc hội, Hội đồng nhân dân các cấp quyết định cho địa phương và số vượt thu thực tế của ngân sách địa phương (nếu có) dành cho đầu tư phát triển, nguồn vốn hợp pháp khác, phần vốn quy định tại </w:t>
       </w:r>
       <w:r>
@@ -8756,7 +8692,6 @@
           <w:sz w:val="26"/>
           <w:szCs w:val="26"/>
         </w:rPr>
-        <w:lastRenderedPageBreak/>
         <w:t>đ) Đối với dự án thực hiện trên địa bàn từ 02 đơn vị hành chính cấp huyện, cấp xã trở lên do Ủy ban nhân dân cấp huyện là cơ quan chủ quản, thực hiện theo quy định tại </w:t>
       </w:r>
       <w:r>
@@ -9163,7 +9098,6 @@
           <w:sz w:val="26"/>
           <w:szCs w:val="26"/>
         </w:rPr>
-        <w:lastRenderedPageBreak/>
         <w:t>5. Giám đốc hoặc Tổng giám đốc doanh nghiệp nhà nước quyết định đầu tư dự án nhóm A, nhóm B, nhóm C đã được Hội đồng thành viên hoặc Chủ tịch công ty hoặc Hội đồng quản trị quyết định chủ trương đầu tư.</w:t>
       </w:r>
     </w:p>
@@ -9546,7 +9480,6 @@
           <w:sz w:val="26"/>
           <w:szCs w:val="26"/>
         </w:rPr>
-        <w:lastRenderedPageBreak/>
         <w:t>1. Căn cứ chủ trương đầu tư đã được Chính phủ quyết định, chủ chương trình lập báo cáo nghiên cứu khả thi chương trình và tổ chức thẩm định theo quy định của pháp luật trình Thủ tướng Chính phủ.</w:t>
       </w:r>
     </w:p>
@@ -9896,7 +9829,6 @@
           <w:sz w:val="26"/>
           <w:szCs w:val="26"/>
         </w:rPr>
-        <w:lastRenderedPageBreak/>
         <w:t>a) Căn cứ chủ trương đầu tư đã được cấp có thẩm quyền quyết định, chủ đầu tư lập báo cáo nghiên cứu khả thi dự án trình cấp có thẩm quyền quyết định đầu tư;</w:t>
       </w:r>
     </w:p>
@@ -10197,7 +10129,6 @@
           <w:sz w:val="26"/>
           <w:szCs w:val="26"/>
         </w:rPr>
-        <w:lastRenderedPageBreak/>
         <w:t>đ) Người đứng đầu Bộ, cơ quan trung ương, Chủ tịch Ủy ban nhân dân các cấp được phân cấp cho người đứng đầu cơ quan, đơn vị trực thuộc, đơn vị sự nghiệp công lập trực thuộc tổ chức lập, thẩm định, phê duyệt dự toán nhiệm vụ quy hoạch, dự toán nhiệm vụ chuẩn bị đầu tư.</w:t>
       </w:r>
     </w:p>
@@ -10542,7 +10473,6 @@
           <w:sz w:val="26"/>
           <w:szCs w:val="26"/>
         </w:rPr>
-        <w:lastRenderedPageBreak/>
         <w:t>e) Khi chỉ số giá trong thời gian thực hiện dự án lớn hơn chỉ số giá được sử dụng để tính dự phòng trượt giá trong tổng mức đầu tư dự án được cấp có thẩm quyền quyết định.</w:t>
       </w:r>
     </w:p>
@@ -10905,7 +10835,6 @@
           <w:sz w:val="26"/>
           <w:szCs w:val="26"/>
         </w:rPr>
-        <w:lastRenderedPageBreak/>
         <w:t>2. Báo cáo nghiên cứu khả thi dự án không có cấu phần xây dựng bao gồm các nội dung chủ yếu sau đây:</w:t>
       </w:r>
     </w:p>
@@ -11310,7 +11239,6 @@
           <w:sz w:val="26"/>
           <w:szCs w:val="26"/>
         </w:rPr>
-        <w:lastRenderedPageBreak/>
         <w:t>Chương III</w:t>
       </w:r>
       <w:r>
@@ -11719,7 +11647,6 @@
           <w:sz w:val="26"/>
           <w:szCs w:val="26"/>
         </w:rPr>
-        <w:lastRenderedPageBreak/>
         <w:t>đ) Dự báo tác động của tình hình thế giới và trong nước đến sự phát triển và khả năng huy động các nguồn vốn đầu tư;</w:t>
       </w:r>
     </w:p>
@@ -12064,7 +11991,6 @@
           <w:sz w:val="26"/>
           <w:szCs w:val="26"/>
         </w:rPr>
-        <w:lastRenderedPageBreak/>
         <w:t>2. Phương hướng hoặc kế hoạch phát triển kinh tế - xã hội; mục tiêu, định hướng cơ cấu đầu tư theo ngành, lĩnh vực, chương trình đầu tư công trong trung hạn. Việc phân loại theo ngành, lĩnh vực được thực hiện theo quy định của Luật này.</w:t>
       </w:r>
     </w:p>
@@ -12329,7 +12255,6 @@
           <w:sz w:val="26"/>
           <w:szCs w:val="26"/>
         </w:rPr>
-        <w:lastRenderedPageBreak/>
         <w:t>1. Nhằm thực hiện mục tiêu, định hướng phát triển trong chiến lược, phương hướng hoặc kế hoạch phát triển kinh tế - xã hội và quy hoạch đã được phê duyệt.</w:t>
       </w:r>
     </w:p>
@@ -12690,7 +12615,6 @@
           <w:sz w:val="26"/>
           <w:szCs w:val="26"/>
         </w:rPr>
-        <w:lastRenderedPageBreak/>
         <w:t>a) Chương trình, dự án cần thiết, có đủ điều kiện được bố trí vốn kế hoạch theo quy định tại </w:t>
       </w:r>
       <w:r>
@@ -13087,7 +13011,6 @@
           <w:sz w:val="26"/>
           <w:szCs w:val="26"/>
         </w:rPr>
-        <w:lastRenderedPageBreak/>
         <w:t>Điều 57. Thời gian bố trí vốn thực hiện dự án</w:t>
       </w:r>
     </w:p>
@@ -13386,7 +13309,6 @@
           <w:sz w:val="26"/>
           <w:szCs w:val="26"/>
         </w:rPr>
-        <w:lastRenderedPageBreak/>
         <w:t>5. Chính phủ quy định chi tiết Điều này.</w:t>
       </w:r>
     </w:p>
@@ -13667,7 +13589,6 @@
           <w:sz w:val="26"/>
           <w:szCs w:val="26"/>
         </w:rPr>
-        <w:lastRenderedPageBreak/>
         <w:t>7. Trên cơ sở ý kiến của Quốc hội khóa trước, Chính phủ trình Quốc hội khóa mới tại kỳ họp thứ nhất các nội dung theo quy định tại </w:t>
       </w:r>
       <w:r>
@@ -13876,17 +13797,7 @@
           <w:sz w:val="26"/>
           <w:szCs w:val="26"/>
         </w:rPr>
-        <w:t xml:space="preserve">b) Căn cứ nghị quyết của Hội đồng nhân dân cấp tỉnh về kế hoạch đầu tư công trung hạn, Hội đồng nhân dân cấp huyện quyết định kế hoạch đầu tư công trung hạn của cấp mình, bao gồm tổng mức vốn kế hoạch đầu tư công trung hạn, danh mục, mức vốn ngân sách địa phương bố trí cho từng dự án, tổng mức vốn </w:t>
-      </w:r>
-      <w:r>
-        <w:rPr>
-          <w:rFonts w:ascii="Arial" w:eastAsia="Times New Roman" w:hAnsi="Arial" w:cs="Arial"/>
-          <w:color w:val="2E2E2E"/>
-          <w:sz w:val="26"/>
-          <w:szCs w:val="26"/>
-        </w:rPr>
-        <w:lastRenderedPageBreak/>
-        <w:t>cho nhiệm vụ quy hoạch, tổng mức vốn cho nhiệm vụ chuẩn bị đầu tư, đối tượng đầu tư công khác và mức vốn bổ sung có mục tiêu cho ngân sách cấp dưới;</w:t>
+        <w:t>b) Căn cứ nghị quyết của Hội đồng nhân dân cấp tỉnh về kế hoạch đầu tư công trung hạn, Hội đồng nhân dân cấp huyện quyết định kế hoạch đầu tư công trung hạn của cấp mình, bao gồm tổng mức vốn kế hoạch đầu tư công trung hạn, danh mục, mức vốn ngân sách địa phương bố trí cho từng dự án, tổng mức vốn cho nhiệm vụ quy hoạch, tổng mức vốn cho nhiệm vụ chuẩn bị đầu tư, đối tượng đầu tư công khác và mức vốn bổ sung có mục tiêu cho ngân sách cấp dưới;</w:t>
       </w:r>
     </w:p>
     <w:p>
@@ -14098,17 +14009,7 @@
           <w:sz w:val="26"/>
           <w:szCs w:val="26"/>
         </w:rPr>
-        <w:t xml:space="preserve">6. Trước ngày 31 tháng 12 hằng năm, các Bộ, cơ quan trung ương và địa phương phân bổ chi tiết mức vốn kế hoạch đầu tư vốn ngân sách trung ương năm sau, danh mục, mức vốn bố trí của từng nhiệm vụ, dự án, gửi phương án </w:t>
-      </w:r>
-      <w:r>
-        <w:rPr>
-          <w:rFonts w:ascii="Arial" w:eastAsia="Times New Roman" w:hAnsi="Arial" w:cs="Arial"/>
-          <w:color w:val="2E2E2E"/>
-          <w:sz w:val="26"/>
-          <w:szCs w:val="26"/>
-        </w:rPr>
-        <w:lastRenderedPageBreak/>
-        <w:t>phân bổ chi tiết cho Bộ Kế hoạch và Đầu tư, Bộ Tài chính để tổng hợp, báo cáo Chính phủ và theo dõi thực hiện.</w:t>
+        <w:t>6. Trước ngày 31 tháng 12 hằng năm, các Bộ, cơ quan trung ương và địa phương phân bổ chi tiết mức vốn kế hoạch đầu tư vốn ngân sách trung ương năm sau, danh mục, mức vốn bố trí của từng nhiệm vụ, dự án, gửi phương án phân bổ chi tiết cho Bộ Kế hoạch và Đầu tư, Bộ Tài chính để tổng hợp, báo cáo Chính phủ và theo dõi thực hiện.</w:t>
       </w:r>
     </w:p>
     <w:p>
@@ -14460,17 +14361,7 @@
           <w:sz w:val="26"/>
           <w:szCs w:val="26"/>
         </w:rPr>
-        <w:t xml:space="preserve">6. Đối với ngân sách địa phương, ngoài các nguyên tắc nêu trên, phải phù hợp với khả năng cân đối thu, chi ngân sách địa phương, kế hoạch đầu tư công trung hạn và hằng năm, khả năng huy động các nguồn vốn đầu tư khác đối với các dự </w:t>
-      </w:r>
-      <w:r>
-        <w:rPr>
-          <w:rFonts w:ascii="Arial" w:eastAsia="Times New Roman" w:hAnsi="Arial" w:cs="Arial"/>
-          <w:color w:val="2E2E2E"/>
-          <w:sz w:val="26"/>
-          <w:szCs w:val="26"/>
-        </w:rPr>
-        <w:lastRenderedPageBreak/>
-        <w:t>án sử dụng nhiều nguồn vốn đầu tư và thuộc chương trình, nhiệm vụ chi đầu tư phát triển nguồn ngân sách địa phương đã được phê duyệt.</w:t>
+        <w:t>6. Đối với ngân sách địa phương, ngoài các nguyên tắc nêu trên, phải phù hợp với khả năng cân đối thu, chi ngân sách địa phương, kế hoạch đầu tư công trung hạn và hằng năm, khả năng huy động các nguồn vốn đầu tư khác đối với các dự án sử dụng nhiều nguồn vốn đầu tư và thuộc chương trình, nhiệm vụ chi đầu tư phát triển nguồn ngân sách địa phương đã được phê duyệt.</w:t>
       </w:r>
     </w:p>
     <w:p>
@@ -14748,7 +14639,6 @@
           <w:sz w:val="26"/>
           <w:szCs w:val="26"/>
         </w:rPr>
-        <w:lastRenderedPageBreak/>
         <w:t>2. Dự án đầu tư sử dụng vốn ODA không hoàn lại không thuộc trường hợp quy định tại điểm b khoản 1 Điều này không phải lập đề xuất dự án.</w:t>
       </w:r>
     </w:p>
@@ -14979,7 +14869,6 @@
           <w:sz w:val="26"/>
           <w:szCs w:val="26"/>
         </w:rPr>
-        <w:lastRenderedPageBreak/>
         <w:t>Điều 64. Chủ trương đầu tư chương trình, dự án đầu tư công sử dụng vốn ODA, vốn vay ưu đãi nước ngoài</w:t>
       </w:r>
     </w:p>
@@ -15673,17 +15562,7 @@
           <w:sz w:val="26"/>
           <w:szCs w:val="26"/>
         </w:rPr>
-        <w:t xml:space="preserve">, thực hiện trình tự, thủ tục </w:t>
-      </w:r>
-      <w:r>
-        <w:rPr>
-          <w:rFonts w:ascii="Arial" w:eastAsia="Times New Roman" w:hAnsi="Arial" w:cs="Arial"/>
-          <w:color w:val="2E2E2E"/>
-          <w:sz w:val="26"/>
-          <w:szCs w:val="26"/>
-        </w:rPr>
-        <w:lastRenderedPageBreak/>
-        <w:t>điều chỉnh đề xuất dự án trước khi trình cấp có thẩm quyền phê duyệt điều chỉnh chủ trương đầu tư dự án theo quy định.</w:t>
+        <w:t>, thực hiện trình tự, thủ tục điều chỉnh đề xuất dự án trước khi trình cấp có thẩm quyền phê duyệt điều chỉnh chủ trương đầu tư dự án theo quy định.</w:t>
       </w:r>
     </w:p>
     <w:p>
@@ -16269,7 +16148,6 @@
           <w:sz w:val="26"/>
           <w:szCs w:val="26"/>
         </w:rPr>
-        <w:lastRenderedPageBreak/>
         <w:t>1. Trình tự, thủ tục dừng sử dụng vốn ODA, vốn vay ưu đãi nước ngoài khi chương trình, dự án chưa thực hiện được quy định như sau:</w:t>
       </w:r>
     </w:p>
@@ -16490,7 +16368,6 @@
           <w:sz w:val="26"/>
           <w:szCs w:val="26"/>
         </w:rPr>
-        <w:lastRenderedPageBreak/>
         <w:t>e) Trường hợp cơ quan chủ quản thực hiện phê duyệt điều chỉnh dự án sử dụng vốn ODA, vốn vay ưu đãi nước ngoài, điều chỉnh cơ cấu nguồn vốn trong nước và nước ngoài để thực hiện các hạng mục đầu tư chưa triển khai của dự án thì trình tự, thủ tục lập, thẩm định, phê duyệt chủ trương đầu tư, quyết định đầu tư dự án thực hiện theo quy định của Luật này.</w:t>
       </w:r>
     </w:p>
@@ -16771,7 +16648,6 @@
           <w:sz w:val="26"/>
           <w:szCs w:val="26"/>
         </w:rPr>
-        <w:lastRenderedPageBreak/>
         <w:t>3. Thủ tướng Chính phủ điều phối, lồng ghép các nguồn vốn thực hiện các chương trình đầu tư sử dụng vốn ngân sách nhà nước của các Bộ, cơ quan trung ương và địa phương, cơ quan, đơn vị sử dụng vốn đầu tư công nhưng không làm thay đổi mục tiêu thực hiện của chương trình.</w:t>
       </w:r>
     </w:p>
@@ -17134,7 +17010,6 @@
           <w:sz w:val="26"/>
           <w:szCs w:val="26"/>
         </w:rPr>
-        <w:lastRenderedPageBreak/>
         <w:t>2. Bộ Kế hoạch và Đầu tư hướng dẫn, theo dõi, kiểm tra việc thực hiện kế hoạch đầu tư công trung hạn và hằng năm của các Bộ, cơ quan trung ương và Ủy ban nhân dân cấp tỉnh.</w:t>
       </w:r>
     </w:p>
@@ -17417,7 +17292,6 @@
           <w:sz w:val="26"/>
           <w:szCs w:val="26"/>
         </w:rPr>
-        <w:lastRenderedPageBreak/>
         <w:t>5. Người đứng đầu Bộ, cơ quan trung ương có thẩm quyền và trách nhiệm sau đây:</w:t>
       </w:r>
     </w:p>
@@ -17720,7 +17594,6 @@
           <w:sz w:val="26"/>
           <w:szCs w:val="26"/>
         </w:rPr>
-        <w:lastRenderedPageBreak/>
         <w:t>1. Thời gian thực hiện và giải ngân vốn kế hoạch đầu tư công hằng năm đến ngày 31 tháng 01 năm sau. Trường hợp được cấp có thẩm quyền bổ sung vốn cho Bộ, cơ quan trung ương, địa phương sau ngày 30 tháng 9 năm kế hoạch để thực hiện các nhiệm vụ, chương trình, dự án, thời gian thực hiện và giải ngân kế hoạch vốn được bổ sung đến hết ngày 31 tháng 12 năm sau.</w:t>
       </w:r>
     </w:p>
@@ -18049,7 +17922,6 @@
           <w:sz w:val="26"/>
           <w:szCs w:val="26"/>
         </w:rPr>
-        <w:lastRenderedPageBreak/>
         <w:t>a) Tình hình thực hiện quy định của pháp luật về đầu tư công;</w:t>
       </w:r>
     </w:p>
@@ -18454,7 +18326,6 @@
           <w:sz w:val="26"/>
           <w:szCs w:val="26"/>
         </w:rPr>
-        <w:lastRenderedPageBreak/>
         <w:t>c) Cơ quan chủ quản, người có thẩm quyền quyết định đầu tư tổ chức kiểm tra khi điều chỉnh chương trình, dự án làm thay đổi địa điểm, mục tiêu, cơ cấu nguồn vốn, tăng tổng mức đầu tư và trường hợp cần thiết khác;</w:t>
       </w:r>
     </w:p>
@@ -18839,7 +18710,6 @@
           <w:sz w:val="26"/>
           <w:szCs w:val="26"/>
         </w:rPr>
-        <w:lastRenderedPageBreak/>
         <w:t>b) Bài học rút ra sau quá trình thực hiện chương trình, dự án và đề xuất các khuyến nghị cần thiết; trách nhiệm của tổ chức tư vấn, cơ quan chủ quản, chủ chương trình, chủ đầu tư, người có thẩm quyền quyết định chủ trương đầu tư, quyết định đầu tư và cơ quan, tổ chức, cá nhân có liên quan.</w:t>
       </w:r>
     </w:p>
@@ -19162,17 +19032,7 @@
           <w:sz w:val="26"/>
           <w:szCs w:val="26"/>
         </w:rPr>
-        <w:t xml:space="preserve">2. Cơ quan chủ quản tham khảo, giải trình, tiếp thu ý kiến cộng đồng dân cư nơi thực hiện dự án đối với việc quyết định đầu tư dự án quan trọng quốc gia, dự án nhóm A, dự án có quy mô di dân, tái định canh, định cư lớn, dự án có nguy cơ tác động lớn đến môi trường, dự án có ảnh hưởng trực tiếp tới đời sống kinh tế - xã hội của cộng đồng dân cư nơi thực hiện dự án về chủ trương, chính sách đầu </w:t>
-      </w:r>
-      <w:r>
-        <w:rPr>
-          <w:rFonts w:ascii="Arial" w:eastAsia="Times New Roman" w:hAnsi="Arial" w:cs="Arial"/>
-          <w:color w:val="2E2E2E"/>
-          <w:sz w:val="26"/>
-          <w:szCs w:val="26"/>
-        </w:rPr>
-        <w:lastRenderedPageBreak/>
-        <w:t>tư, xây dựng, đất đai, xử lý chất thải và bảo vệ môi trường, đền bù, giải phóng mặt bằng và phương án tái định canh, định cư theo quy định của pháp luật.</w:t>
+        <w:t>2. Cơ quan chủ quản tham khảo, giải trình, tiếp thu ý kiến cộng đồng dân cư nơi thực hiện dự án đối với việc quyết định đầu tư dự án quan trọng quốc gia, dự án nhóm A, dự án có quy mô di dân, tái định canh, định cư lớn, dự án có nguy cơ tác động lớn đến môi trường, dự án có ảnh hưởng trực tiếp tới đời sống kinh tế - xã hội của cộng đồng dân cư nơi thực hiện dự án về chủ trương, chính sách đầu tư, xây dựng, đất đai, xử lý chất thải và bảo vệ môi trường, đền bù, giải phóng mặt bằng và phương án tái định canh, định cư theo quy định của pháp luật.</w:t>
       </w:r>
     </w:p>
     <w:p>
@@ -19581,7 +19441,6 @@
           <w:sz w:val="26"/>
           <w:szCs w:val="26"/>
         </w:rPr>
-        <w:lastRenderedPageBreak/>
         <w:t>1. Chủ chương trình và chủ đầu tư chịu trách nhiệm tổ chức thực hiện theo dõi, kiểm tra và đánh giá ban đầu, giữa kỳ và kết thúc chương trình, dự án.</w:t>
       </w:r>
     </w:p>
@@ -19985,7 +19844,6 @@
           <w:sz w:val="26"/>
           <w:szCs w:val="26"/>
         </w:rPr>
-        <w:lastRenderedPageBreak/>
         <w:t>6. Quyết định việc phân bổ dự phòng chung kế hoạch đầu tư công trung hạn vốn ngân sách trung ương cho các nhiệm vụ, dự án, đối tượng đầu tư công khác khi bảo đảm nguồn vốn.</w:t>
       </w:r>
     </w:p>
@@ -20290,17 +20148,7 @@
           <w:sz w:val="26"/>
           <w:szCs w:val="26"/>
         </w:rPr>
-        <w:t xml:space="preserve">2. Giao kế hoạch đầu tư công trung hạn và hằng năm vốn ngân sách nhà nước, giao dự toán ngân sách nhà nước và kế hoạch vốn đầu tư công từ nguồn tăng </w:t>
-      </w:r>
-      <w:r>
-        <w:rPr>
-          <w:rFonts w:ascii="Arial" w:eastAsia="Times New Roman" w:hAnsi="Arial" w:cs="Arial"/>
-          <w:color w:val="2E2E2E"/>
-          <w:sz w:val="26"/>
-          <w:szCs w:val="26"/>
-        </w:rPr>
-        <w:lastRenderedPageBreak/>
-        <w:t>thu, tiết kiệm chi ngân sách trung ương cho các Bộ, cơ quan trung ương và địa phương.</w:t>
+        <w:t>2. Giao kế hoạch đầu tư công trung hạn và hằng năm vốn ngân sách nhà nước, giao dự toán ngân sách nhà nước và kế hoạch vốn đầu tư công từ nguồn tăng thu, tiết kiệm chi ngân sách trung ương cho các Bộ, cơ quan trung ương và địa phương.</w:t>
       </w:r>
     </w:p>
     <w:p>
@@ -20648,7 +20496,6 @@
           <w:sz w:val="26"/>
           <w:szCs w:val="26"/>
         </w:rPr>
-        <w:lastRenderedPageBreak/>
         <w:t>2. Phối hợp với Bộ Kế hoạch và Đầu tư báo cáo Chính phủ xác định vốn đầu tư nguồn ngân sách nhà nước chi cho đầu tư công của quốc gia theo từng ngành, lĩnh vực trong kế hoạch đầu tư công trung hạn và hằng năm.</w:t>
       </w:r>
     </w:p>
@@ -21069,7 +20916,6 @@
           <w:sz w:val="26"/>
           <w:szCs w:val="26"/>
         </w:rPr>
-        <w:lastRenderedPageBreak/>
         <w:t>1. Thực hiện quản lý nhà nước về đầu tư công trên địa bàn theo quy định của pháp luật.</w:t>
       </w:r>
     </w:p>
@@ -21412,7 +21258,6 @@
           <w:sz w:val="26"/>
           <w:szCs w:val="26"/>
         </w:rPr>
-        <w:lastRenderedPageBreak/>
         <w:t>a) Quyết định chủ trương đầu tư chương trình đầu tư công sử dụng vốn ngân sách địa phương, bao gồm vốn bổ sung có mục tiêu từ ngân sách cấp trên;</w:t>
       </w:r>
     </w:p>
@@ -21737,17 +21582,7 @@
           <w:sz w:val="26"/>
           <w:szCs w:val="26"/>
         </w:rPr>
-        <w:t xml:space="preserve">2. Trường hợp chương trình, dự án có thời gian thực hiện trong 02 kỳ kế hoạch đầu tư công trung hạn liên tiếp, ngoài quy định tại khoản 1 Điều này, cơ quan, tổ </w:t>
-      </w:r>
-      <w:r>
-        <w:rPr>
-          <w:rFonts w:ascii="Arial" w:eastAsia="Times New Roman" w:hAnsi="Arial" w:cs="Arial"/>
-          <w:color w:val="2E2E2E"/>
-          <w:sz w:val="26"/>
-          <w:szCs w:val="26"/>
-        </w:rPr>
-        <w:lastRenderedPageBreak/>
-        <w:t>chức, cá nhân và người đứng đầu tổ chức quyết định chủ trương đầu tư chương trình, dự án có trách nhiệm sau đây:</w:t>
+        <w:t>2. Trường hợp chương trình, dự án có thời gian thực hiện trong 02 kỳ kế hoạch đầu tư công trung hạn liên tiếp, ngoài quy định tại khoản 1 Điều này, cơ quan, tổ chức, cá nhân và người đứng đầu tổ chức quyết định chủ trương đầu tư chương trình, dự án có trách nhiệm sau đây:</w:t>
       </w:r>
     </w:p>
     <w:p>
@@ -21971,7 +21806,6 @@
           <w:sz w:val="26"/>
           <w:szCs w:val="26"/>
         </w:rPr>
-        <w:lastRenderedPageBreak/>
         <w:t>Điều 95. Quyền và trách nhiệm của cơ quan, tổ chức, cá nhân quyết định đầu tư chương trình, dự án</w:t>
       </w:r>
     </w:p>
@@ -22298,7 +22132,6 @@
           <w:sz w:val="26"/>
           <w:szCs w:val="26"/>
         </w:rPr>
-        <w:lastRenderedPageBreak/>
         <w:t>1. Tổ chức quản lý, thực hiện chương trình, dự án bảo đảm đúng mục tiêu, tiến độ, chất lượng và hiệu quả của chương trình, dự án.</w:t>
       </w:r>
     </w:p>
@@ -22585,7 +22418,6 @@
           <w:sz w:val="26"/>
           <w:szCs w:val="26"/>
         </w:rPr>
-        <w:lastRenderedPageBreak/>
         <w:t>3. Thông tin, dữ liệu thuộc Hệ thống thông tin và cơ sở dữ liệu quốc gia về đầu tư công là thông tin, dữ liệu gốc của các chương trình, dự án và kế hoạch đầu tư công.</w:t>
       </w:r>
     </w:p>
@@ -22870,7 +22702,7 @@
         </w:rPr>
         <w:t>4. Sửa đổi, bổ sung </w:t>
       </w:r>
-      <w:hyperlink r:id="rId4" w:history="1">
+      <w:hyperlink r:id="rId7" w:history="1">
         <w:r>
           <w:rPr>
             <w:rFonts w:ascii="Arial" w:eastAsia="Times New Roman" w:hAnsi="Arial" w:cs="Arial"/>
@@ -23085,7 +22917,7 @@
         </w:rPr>
         <w:t>a) Bổ sung khoản 9 vào sau </w:t>
       </w:r>
-      <w:hyperlink r:id="rId5" w:history="1">
+      <w:hyperlink r:id="rId8" w:history="1">
         <w:r>
           <w:rPr>
             <w:rFonts w:ascii="Arial" w:eastAsia="Times New Roman" w:hAnsi="Arial" w:cs="Arial"/>
@@ -23136,7 +22968,7 @@
         </w:rPr>
         <w:t>b) Bổ sung khoản 7 vào sau </w:t>
       </w:r>
-      <w:hyperlink r:id="rId6" w:history="1">
+      <w:hyperlink r:id="rId9" w:history="1">
         <w:r>
           <w:rPr>
             <w:rFonts w:ascii="Arial" w:eastAsia="Times New Roman" w:hAnsi="Arial" w:cs="Arial"/>
@@ -23187,7 +23019,7 @@
         </w:rPr>
         <w:t>c) Bổ sung khoản 4 vào sau </w:t>
       </w:r>
-      <w:hyperlink r:id="rId7" w:history="1">
+      <w:hyperlink r:id="rId10" w:history="1">
         <w:r>
           <w:rPr>
             <w:rFonts w:ascii="Arial" w:eastAsia="Times New Roman" w:hAnsi="Arial" w:cs="Arial"/>
@@ -23236,10 +23068,9 @@
           <w:sz w:val="26"/>
           <w:szCs w:val="26"/>
         </w:rPr>
-        <w:lastRenderedPageBreak/>
         <w:t>d) Bổ sung khoản 6 vào sau </w:t>
       </w:r>
-      <w:hyperlink r:id="rId8" w:history="1">
+      <w:hyperlink r:id="rId11" w:history="1">
         <w:r>
           <w:rPr>
             <w:rFonts w:ascii="Arial" w:eastAsia="Times New Roman" w:hAnsi="Arial" w:cs="Arial"/>
@@ -23290,7 +23121,7 @@
         </w:rPr>
         <w:t>đ) Bổ sung khoản 4 vào sau </w:t>
       </w:r>
-      <w:hyperlink r:id="rId9" w:history="1">
+      <w:hyperlink r:id="rId12" w:history="1">
         <w:r>
           <w:rPr>
             <w:rFonts w:ascii="Arial" w:eastAsia="Times New Roman" w:hAnsi="Arial" w:cs="Arial"/>
@@ -23341,7 +23172,7 @@
         </w:rPr>
         <w:t>e) Bổ sung khoản 4 vào sau </w:t>
       </w:r>
-      <w:hyperlink r:id="rId10" w:history="1">
+      <w:hyperlink r:id="rId13" w:history="1">
         <w:r>
           <w:rPr>
             <w:rFonts w:ascii="Arial" w:eastAsia="Times New Roman" w:hAnsi="Arial" w:cs="Arial"/>
@@ -23430,7 +23261,7 @@
         </w:rPr>
         <w:t>a) Sửa đổi </w:t>
       </w:r>
-      <w:hyperlink r:id="rId11" w:history="1">
+      <w:hyperlink r:id="rId14" w:history="1">
         <w:r>
           <w:rPr>
             <w:rFonts w:ascii="Arial" w:eastAsia="Times New Roman" w:hAnsi="Arial" w:cs="Arial"/>
@@ -23481,7 +23312,7 @@
         </w:rPr>
         <w:t>b) Bỏ cụm từ “và điểm d” tại </w:t>
       </w:r>
-      <w:hyperlink r:id="rId12" w:history="1">
+      <w:hyperlink r:id="rId15" w:history="1">
         <w:r>
           <w:rPr>
             <w:rFonts w:ascii="Arial" w:eastAsia="Times New Roman" w:hAnsi="Arial" w:cs="Arial"/>
@@ -23522,7 +23353,7 @@
         </w:rPr>
         <w:t>c) Bãi bỏ </w:t>
       </w:r>
-      <w:hyperlink r:id="rId13" w:history="1">
+      <w:hyperlink r:id="rId16" w:history="1">
         <w:r>
           <w:rPr>
             <w:rFonts w:ascii="Arial" w:eastAsia="Times New Roman" w:hAnsi="Arial" w:cs="Arial"/>
@@ -23543,7 +23374,7 @@
         </w:rPr>
         <w:t>, </w:t>
       </w:r>
-      <w:hyperlink r:id="rId14" w:history="1">
+      <w:hyperlink r:id="rId17" w:history="1">
         <w:r>
           <w:rPr>
             <w:rFonts w:ascii="Arial" w:eastAsia="Times New Roman" w:hAnsi="Arial" w:cs="Arial"/>
@@ -23710,7 +23541,6 @@
           <w:sz w:val="26"/>
           <w:szCs w:val="26"/>
         </w:rPr>
-        <w:lastRenderedPageBreak/>
         <w:t>4. Đối với trường hợp điều chỉnh chủ trương đầu tư các dự án đã được quyết định chủ trương đầu tư trước ngày Luật này có hiệu lực thi hành, cấp có thẩm quyền quyết định chủ trương đầu tư theo phân cấp tại Luật này quyết định điều chỉnh chủ trương đầu tư dự án và chịu trách nhiệm về quyết định của mình, dự án quan trọng quốc gia đã được Quốc hội quyết định chủ trương đầu tư thì Quốc hội quyết định điều chỉnh chủ trương đầu tư dự án.</w:t>
       </w:r>
     </w:p>
@@ -23996,20 +23826,7 @@
                 <w:sz w:val="24"/>
                 <w:szCs w:val="24"/>
               </w:rPr>
-              <w:t xml:space="preserve">               </w:t>
-            </w:r>
-            <w:bookmarkStart w:id="0" w:name="_GoBack"/>
-            <w:bookmarkEnd w:id="0"/>
-            <w:r>
-              <w:rPr>
-                <w:rFonts w:ascii="Times New Roman" w:eastAsia="Times New Roman" w:hAnsi="Times New Roman" w:cs="Times New Roman"/>
-                <w:b/>
-                <w:bCs/>
-                <w:color w:val="222222"/>
-                <w:sz w:val="24"/>
-                <w:szCs w:val="24"/>
-              </w:rPr>
-              <w:t>(đã ký)</w:t>
+              <w:t xml:space="preserve">               (đã ký)</w:t>
             </w:r>
             <w:r>
               <w:rPr>
@@ -24061,7 +23878,7 @@
 </file>
 
 <file path=word/styles.xml><?xml version="1.0" encoding="utf-8"?>
-<w:styles xmlns:mc="http://schemas.openxmlformats.org/markup-compatibility/2006" xmlns:r="http://schemas.openxmlformats.org/officeDocument/2006/relationships" xmlns:w="http://schemas.openxmlformats.org/wordprocessingml/2006/main" xmlns:w14="http://schemas.microsoft.com/office/word/2010/wordml" xmlns:w15="http://schemas.microsoft.com/office/word/2012/wordml" xmlns:w16se="http://schemas.microsoft.com/office/word/2015/wordml/symex" mc:Ignorable="w14 w15 w16se">
+<w:styles xmlns:mc="http://schemas.openxmlformats.org/markup-compatibility/2006" xmlns:r="http://schemas.openxmlformats.org/officeDocument/2006/relationships" xmlns:w="http://schemas.openxmlformats.org/wordprocessingml/2006/main" xmlns:w14="http://schemas.microsoft.com/office/word/2010/wordml" xmlns:w15="http://schemas.microsoft.com/office/word/2012/wordml" xmlns:w16cex="http://schemas.microsoft.com/office/word/2018/wordml/cex" xmlns:w16cid="http://schemas.microsoft.com/office/word/2016/wordml/cid" xmlns:w16="http://schemas.microsoft.com/office/word/2018/wordml" xmlns:w16du="http://schemas.microsoft.com/office/word/2023/wordml/word16du" xmlns:w16sdtdh="http://schemas.microsoft.com/office/word/2020/wordml/sdtdatahash" xmlns:w16sdtfl="http://schemas.microsoft.com/office/word/2024/wordml/sdtformatlock" xmlns:w16se="http://schemas.microsoft.com/office/word/2015/wordml/symex" mc:Ignorable="w14 w15 w16se w16cid w16 w16cex w16sdtdh w16sdtfl w16du">
   <w:docDefaults>
     <w:rPrDefault>
       <w:rPr>
@@ -24077,7 +23894,7 @@
       </w:pPr>
     </w:pPrDefault>
   </w:docDefaults>
-  <w:latentStyles w:defLockedState="0" w:defUIPriority="99" w:defSemiHidden="0" w:defUnhideWhenUsed="0" w:defQFormat="0" w:count="371">
+  <w:latentStyles w:defLockedState="0" w:defUIPriority="99" w:defSemiHidden="0" w:defUnhideWhenUsed="0" w:defQFormat="0" w:count="376">
     <w:lsdException w:name="Normal" w:uiPriority="0" w:qFormat="1"/>
     <w:lsdException w:name="heading 1" w:uiPriority="9" w:qFormat="1"/>
     <w:lsdException w:name="heading 2" w:semiHidden="1" w:uiPriority="9" w:unhideWhenUsed="1" w:qFormat="1"/>
@@ -24449,6 +24266,11 @@
     <w:lsdException w:name="List Table 5 Dark Accent 6" w:uiPriority="50"/>
     <w:lsdException w:name="List Table 6 Colorful Accent 6" w:uiPriority="51"/>
     <w:lsdException w:name="List Table 7 Colorful Accent 6" w:uiPriority="52"/>
+    <w:lsdException w:name="Mention" w:semiHidden="1" w:unhideWhenUsed="1"/>
+    <w:lsdException w:name="Smart Hyperlink" w:semiHidden="1" w:unhideWhenUsed="1"/>
+    <w:lsdException w:name="Hashtag" w:semiHidden="1" w:unhideWhenUsed="1"/>
+    <w:lsdException w:name="Unresolved Mention" w:semiHidden="1" w:unhideWhenUsed="1"/>
+    <w:lsdException w:name="Smart Link" w:semiHidden="1" w:unhideWhenUsed="1"/>
   </w:latentStyles>
   <w:style w:type="paragraph" w:default="1" w:styleId="Normal">
     <w:name w:val="Normal"/>
@@ -24830,6 +24652,15 @@
 </file>
 
 <file path=customXml/item1.xml><?xml version="1.0" encoding="utf-8"?>
+<?mso-contentType ?>
+<FormTemplates xmlns="http://schemas.microsoft.com/sharepoint/v3/contenttype/forms">
+  <Display>DocumentLibraryForm</Display>
+  <Edit>DocumentLibraryForm</Edit>
+  <New>DocumentLibraryForm</New>
+</FormTemplates>
+</file>
+
+<file path=customXml/item2.xml><?xml version="1.0" encoding="utf-8"?>
 <ct:contentTypeSchema xmlns:ct="http://schemas.microsoft.com/office/2006/metadata/contentType" xmlns:ma="http://schemas.microsoft.com/office/2006/metadata/properties/metaAttributes" ct:_="" ma:_="" ma:contentTypeName="Unknown Document Type" ma:contentTypeID="0x010104" ma:contentTypeVersion="0" ma:contentTypeDescription="" ma:contentTypeScope="" ma:versionID="05d83ceaa0bbd2e3bc716e6e66bd857a">
   <xsd:schema xmlns:xsd="http://www.w3.org/2001/XMLSchema" xmlns:xs="http://www.w3.org/2001/XMLSchema" xmlns:p="http://schemas.microsoft.com/office/2006/metadata/properties" targetNamespace="http://schemas.microsoft.com/office/2006/metadata/properties" ma:root="true" ma:fieldsID="b3d69fe45253d5ff147bb69036b756a7">
     <xsd:element name="properties">
@@ -24943,15 +24774,6 @@
 </ct:contentTypeSchema>
 </file>
 
-<file path=customXml/item2.xml><?xml version="1.0" encoding="utf-8"?>
-<?mso-contentType ?>
-<FormTemplates xmlns="http://schemas.microsoft.com/sharepoint/v3/contenttype/forms">
-  <Display>DocumentLibraryForm</Display>
-  <Edit>DocumentLibraryForm</Edit>
-  <New>DocumentLibraryForm</New>
-</FormTemplates>
-</file>
-
 <file path=customXml/item3.xml><?xml version="1.0" encoding="utf-8"?>
 <p:properties xmlns:p="http://schemas.microsoft.com/office/2006/metadata/properties" xmlns:xsi="http://www.w3.org/2001/XMLSchema-instance" xmlns:pc="http://schemas.microsoft.com/office/infopath/2007/PartnerControls">
   <documentManagement/>
@@ -24959,13 +24781,34 @@
 </file>
 
 <file path=customXml/itemProps1.xml><?xml version="1.0" encoding="utf-8"?>
-<ds:datastoreItem xmlns:ds="http://schemas.openxmlformats.org/officeDocument/2006/customXml" ds:itemID="{9455618B-13D0-4EE6-8C40-EC4CB12F871A}"/>
+<ds:datastoreItem xmlns:ds="http://schemas.openxmlformats.org/officeDocument/2006/customXml" ds:itemID="{BCDE1966-B12D-4A10-A24C-88EEE5DA48C1}">
+  <ds:schemaRefs>
+    <ds:schemaRef ds:uri="http://schemas.microsoft.com/sharepoint/v3/contenttype/forms"/>
+  </ds:schemaRefs>
+</ds:datastoreItem>
 </file>
 
 <file path=customXml/itemProps2.xml><?xml version="1.0" encoding="utf-8"?>
-<ds:datastoreItem xmlns:ds="http://schemas.openxmlformats.org/officeDocument/2006/customXml" ds:itemID="{BCDE1966-B12D-4A10-A24C-88EEE5DA48C1}"/>
+<ds:datastoreItem xmlns:ds="http://schemas.openxmlformats.org/officeDocument/2006/customXml" ds:itemID="{9455618B-13D0-4EE6-8C40-EC4CB12F871A}">
+  <ds:schemaRefs>
+    <ds:schemaRef ds:uri="http://schemas.microsoft.com/office/2006/metadata/contentType"/>
+    <ds:schemaRef ds:uri="http://schemas.microsoft.com/office/2006/metadata/properties/metaAttributes"/>
+    <ds:schemaRef ds:uri="http://www.w3.org/2001/XMLSchema"/>
+    <ds:schemaRef ds:uri="http://schemas.microsoft.com/office/2006/metadata/properties"/>
+    <ds:schemaRef ds:uri="http://schemas.openxmlformats.org/package/2006/metadata/core-properties"/>
+    <ds:schemaRef ds:uri="http://purl.org/dc/elements/1.1/"/>
+    <ds:schemaRef ds:uri="http://purl.org/dc/terms/"/>
+    <ds:schemaRef ds:uri="http://schemas.microsoft.com/internal/obd"/>
+    <ds:schemaRef ds:uri="http://schemas.microsoft.com/office/infopath/2007/PartnerControls"/>
+  </ds:schemaRefs>
+</ds:datastoreItem>
 </file>
 
 <file path=customXml/itemProps3.xml><?xml version="1.0" encoding="utf-8"?>
-<ds:datastoreItem xmlns:ds="http://schemas.openxmlformats.org/officeDocument/2006/customXml" ds:itemID="{490FA55F-2E33-4847-AA7D-6F7954D5F4A6}"/>
+<ds:datastoreItem xmlns:ds="http://schemas.openxmlformats.org/officeDocument/2006/customXml" ds:itemID="{490FA55F-2E33-4847-AA7D-6F7954D5F4A6}">
+  <ds:schemaRefs>
+    <ds:schemaRef ds:uri="http://schemas.microsoft.com/office/2006/metadata/properties"/>
+    <ds:schemaRef ds:uri="http://schemas.microsoft.com/office/infopath/2007/PartnerControls"/>
+  </ds:schemaRefs>
+</ds:datastoreItem>
 </file>
</xml_diff>